<commit_message>
Align site + business plan to locked commercial strategy
- FAQ: commission framing changed from % of net (post-OF fee) to % of gross
- constants.ts: BUSINESS_JURISDICTION set to Queensland, Australia
- constants.ts: INSTAGRAM_HANDLE cleared (account not live); INSTAGRAM_URL
  now conditional — all IG buttons hidden until handle is set
- FinalCTA body copy updated to remove Instagram reference
- apply/page.tsx: post-submit IG follow prompt replaced with email CTA
- business-plan.docx: 6 instances of net-based commission framing fixed:
  executive summary, fee-calc description, tier table header, Standard rate
  (50%→40%), Established rate (45%→35% founding cohort/trial), worked example
  (netting+45% → grossing+40%)
- tsc --noEmit: 0 errors

Co-Authored-By: Claude Sonnet 4.6 <noreply@anthropic.com>
</commit_message>
<xml_diff>
--- a/docs/business-plan.docx
+++ b/docs/business-plan.docx
@@ -117,7 +117,7 @@
           <w:sz w:val="22"/>
           <w:szCs w:val="22"/>
         </w:rPr>
-        <w:t xml:space="preserve">We operate on a pure revenue-share model: we earn only when the creator earns. Our target margin is 40–50% of net OnlyFans revenue for full-service partnerships, aligned with industry standards for reputable management agencies.</w:t>
+        <w:t xml:space="preserve">We operate on a pure revenue-share model: we earn only when the creator earns. Our fee is 40% of gross OnlyFans revenue (closing range 30–40%) for full-service partnerships — calculated on gross earnings before any platform fee deduction.</w:t>
       </w:r>
     </w:p>
     <w:p>
@@ -794,7 +794,7 @@
           <w:sz w:val="22"/>
           <w:szCs w:val="22"/>
         </w:rPr>
-        <w:t xml:space="preserve">Pure revenue share. Creator keeps 100% of gross until OnlyFans' own 20% platform fee is deducted; our fee is calculated on net (post-OF) earnings.</w:t>
+        <w:t xml:space="preserve">Pure revenue share. Our fee is calculated on gross OnlyFans earnings — the total creator income before the platform’s own fee. The exact rate is agreed up front and locked in the management agreement.</w:t>
       </w:r>
     </w:p>
     <w:p>
@@ -887,7 +887,7 @@
                 <w:sz w:val="20"/>
                 <w:szCs w:val="20"/>
               </w:rPr>
-              <w:t xml:space="preserve">Creator Net Revenue/Month</w:t>
+              <w:t xml:space="preserve">Creator Gross Revenue/Month</w:t>
             </w:r>
           </w:p>
         </w:tc>
@@ -1009,7 +1009,7 @@
                 <w:sz w:val="20"/>
                 <w:szCs w:val="20"/>
               </w:rPr>
-              <w:t xml:space="preserve">50%</w:t>
+              <w:t xml:space="preserve">40%</w:t>
             </w:r>
           </w:p>
         </w:tc>
@@ -1101,7 +1101,7 @@
                 <w:sz w:val="20"/>
                 <w:szCs w:val="20"/>
               </w:rPr>
-              <w:t xml:space="preserve">45%</w:t>
+              <w:t xml:space="preserve">35% (founding cohort / trial)</w:t>
             </w:r>
           </w:p>
         </w:tc>
@@ -1435,7 +1435,7 @@
           <w:sz w:val="22"/>
           <w:szCs w:val="22"/>
         </w:rPr>
-        <w:t xml:space="preserve">Example for one creator netting $15,000/month after OF fees, on 45% Noir share:</w:t>
+        <w:t xml:space="preserve">Example for one creator grossing $15,000/month, on 40% Noir share:</w:t>
       </w:r>
     </w:p>
     <w:p>

</xml_diff>